<commit_message>
update documentation and examples
</commit_message>
<xml_diff>
--- a/BeginersGuide/UsingElements/output/output_docxElements.docx
+++ b/BeginersGuide/UsingElements/output/output_docxElements.docx
@@ -309,7 +309,56 @@
       </w:r>
     </w:p>
     <w:p>
-      <w:r>w:t</w:r>
+      <w:r>
+        <w:drawing>
+          <wp:inline distT="0" distB="0" distL="0" distR="0">
+            <wp:extent cx="1905000" cy="1905000"/>
+            <wp:effectExtent l="0" t="0" r="0" b="0"/>
+            <wp:docPr id="2" name="Image 2"/>
+            <wp:cNvGraphicFramePr>
+              <a:graphicFrameLocks xmlns:a="http://schemas.openxmlformats.org/drawingml/2006/main" noChangeAspect="1"/>
+            </wp:cNvGraphicFramePr>
+            <a:graphic xmlns:a="http://schemas.openxmlformats.org/drawingml/2006/main">
+              <a:graphicData uri="http://schemas.openxmlformats.org/drawingml/2006/picture">
+                <pic:pic xmlns:pic="http://schemas.openxmlformats.org/drawingml/2006/picture">
+                  <pic:nvPicPr>
+                    <pic:cNvPr id="0" name="Picture 1" descr="image"/>
+                    <pic:cNvPicPr>
+                      <a:picLocks noChangeAspect="1" noChangeArrowheads="1"/>
+                    </pic:cNvPicPr>
+                  </pic:nvPicPr>
+                  <pic:blipFill>
+                    <a:blip r:embed="rId15">
+                      <a:extLst>
+                        <a:ext uri="{28A0092B-C50C-407E-A947-70E740481C1C}">
+                          <a14:useLocalDpi xmlns:a14="http://schemas.microsoft.com/office/drawing/2010/main" val="0"/>
+                        </a:ext>
+                      </a:extLst>
+                    </a:blip>
+                    <a:srcRect/>
+                    <a:stretch>
+                      <a:fillRect/>
+                    </a:stretch>
+                  </pic:blipFill>
+                  <pic:spPr bwMode="auto">
+                    <a:xfrm>
+                      <a:off x="0" y="0"/>
+                      <a:ext cx="1905000" cy="1905000"/>
+                    </a:xfrm>
+                    <a:prstGeom prst="rect">
+                      <a:avLst/>
+                    </a:prstGeom>
+                    <a:noFill/>
+                    <a:ln>
+                      <a:noFill/>
+                    </a:ln>
+                  </pic:spPr>
+                </pic:pic>
+              </a:graphicData>
+            </a:graphic>
+          </wp:inline>
+        </w:drawing>
+      </w:r>
     </w:p>
     <w:p/>
     <w:p>
@@ -350,12 +399,10 @@
             <w:tcW w:w="150" w:type="dxa"/>
             <w:shd w:val="clear" w:color="auto" w:fill="eb4034"/>
             <w:tcBorders>
-              <w:top w:val="double" w:sz="4" w:space="4" w:color="#0000ff"/>
-              <w:bottom w:val="dotted" w:sz="4" w:space="10" w:color="00ff00"/>
-              <w:left w:val="triple" w:sz="20" w:space="10" w:color="#ffff00"/>
-              <w:right w:val="wave" w:sz="38" w:space="8" w:color="#800080"/>
-              <w:tl2br w:val="single" w:sz="18" w:space="3" w:color="#ffc0cb"/>
-              <w:tr2bl w:val="thick" w:sz="15" w:space="15" w:color="#ffa500"/>
+              <w:top w:val="double" w:sz="4" w:space="0" w:color="red"/>
+              <w:bottom w:val="double" w:sz="4" w:space="0" w:color="red"/>
+              <w:left w:val="double" w:sz="4" w:space="0" w:color="red"/>
+              <w:right w:val="double" w:sz="4" w:space="0" w:color="red"/>
             </w:tcBorders>
           </w:tcPr>
           <w:p>

</xml_diff>